<commit_message>
Ep 9 social posts: real Substack URL + Medium link in first comments; fix image (missing promo card -> hero); regen publish-kit docx
Co-Authored-By: Claude Opus 4.8 (1M context) <noreply@anthropic.com>
</commit_message>
<xml_diff>
--- a/docs/exports/blog-episode-9-the-detectives-notebook-PUBLISH-KIT.docx
+++ b/docs/exports/blog-episode-9-the-detectives-notebook-PUBLISH-KIT.docx
@@ -832,12 +832,17 @@
     </w:p>
     <w:p>
       <w:r>
-        <w:t>▸ (2) IMAGE TO ATTACH:  Blog-9-promo-linkedin-fb.png  (1.91:1, headline baked in — best for the feed)</w:t>
+        <w:t>▸ (2) IMAGE TO ATTACH:  Blog-9-hero-detectives-notebook.png  (the casebook hero, 16:9 — best for the feed)</w:t>
       </w:r>
     </w:p>
     <w:p>
       <w:r>
-        <w:t>Alt: Blog-9-hero-detectives-notebook.png (plain hero, no text).  Folder: docs/images/episode-9/</w:t>
+        <w:t>Alt: Blog-9-hero-detectives-notebook-OG-1200x630.jpg (clean 1200x630 link card) or Blog-9-hero-detectives-notebook-alt.png.  Folder: docs/images/episode-9/</w:t>
+      </w:r>
+    </w:p>
+    <w:p>
+      <w:r>
+        <w:t>(NOTE: the headline "promo-linkedin-fb" card was an optional Canva build that wasn't made — the hero works great as-is.)</w:t>
       </w:r>
     </w:p>
     <w:p>
@@ -863,6 +868,11 @@
     <w:p>
       <w:r>
         <w:t>New here? Catch up on the whole series: https://aistockassist.com/?view=learn</w:t>
+      </w:r>
+    </w:p>
+    <w:p>
+      <w:r>
+        <w:t>Prefer Medium? Same article: https://medium.com/@lindsay.hiebert/episode-9-the-detectives-notebook-3754180d1d34</w:t>
       </w:r>
     </w:p>
     <w:p>
@@ -912,12 +922,7 @@
     </w:p>
     <w:p>
       <w:r>
-        <w:t>▸ (2) IMAGE TO ATTACH:  Blog-9-promo-linkedin-fb.png  (1.91:1, headline baked in)</w:t>
-      </w:r>
-    </w:p>
-    <w:p>
-      <w:r>
-        <w:t>Alt: Blog-9-hero-detectives-notebook-OG-1200x630.jpg (clean 1200x630).  Folder: docs/images/episode-9/</w:t>
+        <w:t>▸ (2) IMAGE TO ATTACH:  Blog-9-hero-detectives-notebook.png  (the casebook hero) — or Blog-9-hero-detectives-notebook-OG-1200x630.jpg (clean 1200x630).  Folder: docs/images/episode-9/</w:t>
       </w:r>
     </w:p>
     <w:p>
@@ -938,6 +943,11 @@
     <w:p>
       <w:r>
         <w:t>New to the series? Start at Episode 0 and catch up → https://aistockassist.com/?view=learn</w:t>
+      </w:r>
+    </w:p>
+    <w:p>
+      <w:r>
+        <w:t>Prefer Medium? Same article → https://medium.com/@lindsay.hiebert/episode-9-the-detectives-notebook-3754180d1d34</w:t>
       </w:r>
     </w:p>
     <w:p>
@@ -1111,12 +1121,12 @@
     </w:p>
     <w:p>
       <w:r>
-        <w:t>• LinkedIn — attach: Blog-9-promo-linkedin-fb.png (1.91:1, headline baked in) — or the plain hero if you want no text</w:t>
+        <w:t>• LinkedIn — attach: Blog-9-hero-detectives-notebook.png (the casebook hero, 16:9)</w:t>
       </w:r>
     </w:p>
     <w:p>
       <w:r>
-        <w:t>• Facebook — attach: Blog-9-promo-linkedin-fb.png (1.91:1) — or Blog-9-hero-detectives-notebook-OG-1200x630.jpg</w:t>
+        <w:t>• Facebook — attach: Blog-9-hero-detectives-notebook.png — or Blog-9-hero-detectives-notebook-OG-1200x630.jpg (clean 1200x630)</w:t>
       </w:r>
     </w:p>
     <w:p>
@@ -1146,12 +1156,12 @@
     </w:p>
     <w:p>
       <w:r>
-        <w:t>SOCIAL PROMO CARD (headline baked in — best for LinkedIn + Facebook feed):</w:t>
+        <w:t>SOCIAL PROMO CARD (OPTIONAL — not built; only if you want a headline-baked card later, build in Canva):</w:t>
       </w:r>
     </w:p>
     <w:p>
       <w:r>
-        <w:t>• docs/images/episode-9/Blog-9-promo-linkedin-fb.png — 1.91:1 (1734x907). Casebook still-life + headline "TEN YEARS OF INSTINCT — AND NO WAY TO CHECK IT" / "A decision you can't audit can't make you better." + diamond logo.</w:t>
+        <w:t>• Blog-9-promo-linkedin-fb.png — 1.91:1 (1734x907). Casebook hero + headline "TEN YEARS OF INSTINCT — AND NO WAY TO CHECK IT" / "A decision you can't audit can't make you better." + diamond logo. (Until built, use the plain hero — it works great.)</w:t>
       </w:r>
     </w:p>
     <w:p>

</xml_diff>

<commit_message>
Ep 9 social posts: drop '3 free analyses, no credit card' from post bodies (keep in first-comment CTA + blog)
Co-Authored-By: Claude Opus 4.8 (1M context) <noreply@anthropic.com>
</commit_message>
<xml_diff>
--- a/docs/exports/blog-episode-9-the-detectives-notebook-PUBLISH-KIT.docx
+++ b/docs/exports/blog-episode-9-the-detectives-notebook-PUBLISH-KIT.docx
@@ -812,7 +812,7 @@
     </w:p>
     <w:p>
       <w:r>
-        <w:t>Episode 9 is live (link below). 3 free analyses, no credit card.</w:t>
+        <w:t>Episode 9 is live (link below).</w:t>
       </w:r>
     </w:p>
     <w:p>
@@ -912,7 +912,7 @@
     </w:p>
     <w:p>
       <w:r>
-        <w:t>3 free analyses, no credit card. (Illustrative, not advice.)</w:t>
+        <w:t>(Illustrative, not advice.)</w:t>
       </w:r>
     </w:p>
     <w:p>

</xml_diff>